<commit_message>
Ajout filtre global villes + amélioration UI (couleurs, pages Streamlit, emploi/logement refactor)
</commit_message>
<xml_diff>
--- a/Mode-d'emploi-appli_Jad_Youssef_Justin.docx
+++ b/Mode-d'emploi-appli_Jad_Youssef_Justin.docx
@@ -1093,7 +1093,25 @@
           <w:lang w:eastAsia="fr-FR"/>
           <w14:ligatures w14:val="none"/>
         </w:rPr>
-        <w:t>Ce mode d’emploi a pour objectif de guider l’utilisateur dans l’installation, le lancement et l’utilisation de l’application de comparaison de villes développée dans le cadre de la SAÉ.</w:t>
+        <w:t>Ce mode d’emploi a pour objectif de guider l’utilisateur dans l’installation, le lancement et l’utilisation de l’application de comparaison de villes développée dans le cadre de la SAÉ</w:t>
+      </w:r>
+      <w:r>
+        <w:rPr>
+          <w:rFonts w:eastAsia="Times New Roman" w:cs="Times New Roman"/>
+          <w:kern w:val="0"/>
+          <w:lang w:eastAsia="fr-FR"/>
+          <w14:ligatures w14:val="none"/>
+        </w:rPr>
+        <w:t xml:space="preserve"> Développement et test d’un outil décisionnel</w:t>
+      </w:r>
+      <w:r>
+        <w:rPr>
+          <w:rFonts w:eastAsia="Times New Roman" w:cs="Times New Roman"/>
+          <w:kern w:val="0"/>
+          <w:lang w:eastAsia="fr-FR"/>
+          <w14:ligatures w14:val="none"/>
+        </w:rPr>
+        <w:t>.</w:t>
       </w:r>
     </w:p>
     <w:p>
@@ -1113,47 +1131,34 @@
           <w:lang w:eastAsia="fr-FR"/>
           <w14:ligatures w14:val="none"/>
         </w:rPr>
-        <w:t xml:space="preserve">L’application permet de comparer les villes de </w:t>
-      </w:r>
-      <w:r>
-        <w:rPr>
-          <w:rFonts w:eastAsia="Times New Roman" w:cs="Times New Roman"/>
-          <w:b/>
-          <w:bCs/>
-          <w:kern w:val="0"/>
-          <w:lang w:eastAsia="fr-FR"/>
-          <w14:ligatures w14:val="none"/>
-        </w:rPr>
-        <w:t>Paris</w:t>
-      </w:r>
-      <w:r>
-        <w:rPr>
-          <w:rFonts w:eastAsia="Times New Roman" w:cs="Times New Roman"/>
-          <w:kern w:val="0"/>
-          <w:lang w:eastAsia="fr-FR"/>
-          <w14:ligatures w14:val="none"/>
-        </w:rPr>
-        <w:t xml:space="preserve"> et </w:t>
-      </w:r>
-      <w:r>
-        <w:rPr>
-          <w:rFonts w:eastAsia="Times New Roman" w:cs="Times New Roman"/>
-          <w:b/>
-          <w:bCs/>
-          <w:kern w:val="0"/>
-          <w:lang w:eastAsia="fr-FR"/>
-          <w14:ligatures w14:val="none"/>
-        </w:rPr>
-        <w:t>Lyon</w:t>
-      </w:r>
-      <w:r>
-        <w:rPr>
-          <w:rFonts w:eastAsia="Times New Roman" w:cs="Times New Roman"/>
-          <w:kern w:val="0"/>
-          <w:lang w:eastAsia="fr-FR"/>
-          <w14:ligatures w14:val="none"/>
-        </w:rPr>
-        <w:t xml:space="preserve"> selon plusieurs dimensions : les équipements, la météo, le logement et l’emploi. Elle propose une interface interactive facilitant l’exploration des données et leur interprétation.</w:t>
+        <w:t xml:space="preserve">L’application permet de </w:t>
+      </w:r>
+      <w:r>
+        <w:rPr>
+          <w:rFonts w:eastAsia="Times New Roman" w:cs="Times New Roman"/>
+          <w:kern w:val="0"/>
+          <w:lang w:eastAsia="fr-FR"/>
+          <w14:ligatures w14:val="none"/>
+        </w:rPr>
+        <w:t>comparer deux villes françaises sélectionnées par l’utilisateur parmi celles de plus de 20 000 habitants</w:t>
+      </w:r>
+      <w:r>
+        <w:rPr>
+          <w:rFonts w:eastAsia="Times New Roman" w:cs="Times New Roman"/>
+          <w:kern w:val="0"/>
+          <w:lang w:eastAsia="fr-FR"/>
+          <w14:ligatures w14:val="none"/>
+        </w:rPr>
+        <w:t xml:space="preserve"> </w:t>
+      </w:r>
+      <w:r>
+        <w:rPr>
+          <w:rFonts w:eastAsia="Times New Roman" w:cs="Times New Roman"/>
+          <w:kern w:val="0"/>
+          <w:lang w:eastAsia="fr-FR"/>
+          <w14:ligatures w14:val="none"/>
+        </w:rPr>
+        <w:t>selon plusieurs dimensions : les équipements, la météo, le logement et l’emploi. Elle propose une interface interactive facilitant l’exploration des données et leur interprétation.</w:t>
       </w:r>
     </w:p>
     <w:p>
@@ -1553,6 +1558,7 @@
           <w:lang w:eastAsia="fr-FR"/>
           <w14:ligatures w14:val="none"/>
         </w:rPr>
+        <w:lastRenderedPageBreak/>
         <w:t>source</w:t>
       </w:r>
       <w:proofErr w:type="gramEnd"/>
@@ -1636,7 +1642,6 @@
           <w:lang w:eastAsia="fr-FR"/>
           <w14:ligatures w14:val="none"/>
         </w:rPr>
-        <w:lastRenderedPageBreak/>
         <w:t>streamlitenv</w:t>
       </w:r>
       <w:proofErr w:type="spellEnd"/>
@@ -2017,7 +2022,19 @@
         <w:rPr>
           <w:rFonts w:asciiTheme="minorHAnsi" w:hAnsiTheme="minorHAnsi"/>
         </w:rPr>
-        <w:t>Chaque page correspond à une dimension spécifique de l’analyse.</w:t>
+        <w:t>Chaque page correspond à une dimension spécifique de l’analyse</w:t>
+      </w:r>
+      <w:r>
+        <w:rPr>
+          <w:rFonts w:asciiTheme="minorHAnsi" w:hAnsiTheme="minorHAnsi"/>
+        </w:rPr>
+        <w:t xml:space="preserve"> et</w:t>
+      </w:r>
+      <w:r>
+        <w:rPr>
+          <w:rFonts w:asciiTheme="minorHAnsi" w:hAnsiTheme="minorHAnsi"/>
+        </w:rPr>
+        <w:t xml:space="preserve"> s’adapte dynamiquement aux villes sélectionnées par l’utilisateur.</w:t>
       </w:r>
     </w:p>
     <w:p>
@@ -2034,6 +2051,35 @@
       </w:pPr>
       <w:r>
         <w:t>6. Utilisation de l’application</w:t>
+      </w:r>
+    </w:p>
+    <w:p>
+      <w:pPr>
+        <w:pStyle w:val="Titre2"/>
+      </w:pPr>
+      <w:r>
+        <w:t>6.0 Sélection des villes</w:t>
+      </w:r>
+    </w:p>
+    <w:p>
+      <w:r>
+        <w:t>L’utilisateur doit sélectionner deux villes via les menus déroulants disponibles dans l’interface.</w:t>
+      </w:r>
+      <w:r>
+        <w:t xml:space="preserve"> </w:t>
+      </w:r>
+      <w:r>
+        <w:t xml:space="preserve">Les villes proposées sont automatiquement filtrées pour ne conserver que </w:t>
+      </w:r>
+      <w:r>
+        <w:lastRenderedPageBreak/>
+        <w:t>les communes de plus de 20 000 habitants.</w:t>
+      </w:r>
+      <w:r>
+        <w:t xml:space="preserve"> </w:t>
+      </w:r>
+      <w:r>
+        <w:t>Il n’est pas possible de sélectionner deux fois la même ville.</w:t>
       </w:r>
     </w:p>
     <w:p>
@@ -2106,7 +2152,6 @@
         <w:spacing w:before="100" w:beforeAutospacing="1" w:after="100" w:afterAutospacing="1" w:line="240" w:lineRule="auto"/>
       </w:pPr>
       <w:r>
-        <w:lastRenderedPageBreak/>
         <w:t xml:space="preserve">Un graphique comparatif par catégorie </w:t>
       </w:r>
     </w:p>
@@ -2384,6 +2429,7 @@
         <w:rPr>
           <w:rFonts w:asciiTheme="minorHAnsi" w:hAnsiTheme="minorHAnsi"/>
         </w:rPr>
+        <w:lastRenderedPageBreak/>
         <w:t>Cette section permet d’évaluer l’accessibilité immobilière dans chaque ville.</w:t>
       </w:r>
     </w:p>
@@ -2448,7 +2494,6 @@
         <w:spacing w:before="100" w:beforeAutospacing="1" w:after="100" w:afterAutospacing="1" w:line="240" w:lineRule="auto"/>
       </w:pPr>
       <w:r>
-        <w:lastRenderedPageBreak/>
         <w:t>Les</w:t>
       </w:r>
       <w:r>
@@ -2785,7 +2830,6 @@
         <w:pStyle w:val="Titre1"/>
       </w:pPr>
       <w:r>
-        <w:lastRenderedPageBreak/>
         <w:t>10. Limitations</w:t>
       </w:r>
     </w:p>
@@ -2824,7 +2868,7 @@
         <w:spacing w:before="100" w:beforeAutospacing="1" w:after="100" w:afterAutospacing="1" w:line="240" w:lineRule="auto"/>
       </w:pPr>
       <w:r>
-        <w:t xml:space="preserve">Seules deux villes sont actuellement disponibles </w:t>
+        <w:t>La comparaison est limitée à deux villes simultanément</w:t>
       </w:r>
     </w:p>
     <w:p>
@@ -5283,7 +5327,6 @@
     <w:next w:val="Normal"/>
     <w:link w:val="Titre3Car"/>
     <w:uiPriority w:val="9"/>
-    <w:semiHidden/>
     <w:unhideWhenUsed/>
     <w:qFormat/>
     <w:rsid w:val="00F94DE0"/>
@@ -5490,7 +5533,6 @@
     <w:basedOn w:val="Policepardfaut"/>
     <w:link w:val="Titre3"/>
     <w:uiPriority w:val="9"/>
-    <w:semiHidden/>
     <w:rsid w:val="00F94DE0"/>
     <w:rPr>
       <w:rFonts w:eastAsiaTheme="majorEastAsia" w:cstheme="majorBidi"/>

</xml_diff>